<commit_message>
Adiciona nome do cliente na proposta e converte anexo do e-mail para PDF
A proposta agora exibe a razão social do cliente na capa, no mesmo
formato do exemplo real (nome grande acima de "PROPOSTA COMERCIAL
STRADA"), usando o nome que a busca por CNPJ na Receita já preenche.

O anexo enviado por e-mail passa a ser PDF em vez de .docx, convertido
via CloudConvert para preservar a formatação exata do modelo aprovado
pelo jurídico (capa centralizada, quebras de página).
</commit_message>
<xml_diff>
--- a/src/lib/comercial/templates/proposta.docx
+++ b/src/lib/comercial/templates/proposta.docx
@@ -698,6 +698,29 @@
           <w:sz w:val="22"/>
           <w:szCs w:val="22"/>
         </w:rPr>
+      </w:r>
+    </w:p>
+    <w:p>
+      <w:pPr>
+        <w:pStyle w:val="Normal1"/>
+        <w:jc w:val="center"/>
+        <w:rPr>
+          <w:rFonts w:ascii="Calibri" w:hAnsi="Calibri" w:cs="Calibri"/>
+          <w:b/>
+          <w:bCs/>
+          <w:sz w:val="56"/>
+          <w:szCs w:val="56"/>
+        </w:rPr>
+      </w:pPr>
+      <w:r>
+        <w:rPr>
+          <w:rFonts w:ascii="Calibri" w:hAnsi="Calibri" w:cs="Calibri"/>
+          <w:b/>
+          <w:bCs/>
+          <w:sz w:val="56"/>
+          <w:szCs w:val="56"/>
+        </w:rPr>
+        <w:t xml:space="preserve">{{RAZAO_SOCIAL}}</w:t>
       </w:r>
     </w:p>
     <w:p>

</xml_diff>